<commit_message>
Corrige ana_07 : lycées Roubaix manquants + référence académie erronée
- Ajoute les moyennes Roubaix voie GT (95,0) et voie PRO (80,2), oubliées
  lors de la première rédaction alors qu'elles étaient déjà calculées
  pour le fichier Excel
- Corrige la référence académie voie PRO : 81,6 (académie de Lille) et
  non 82,3 qui était en réalité la valeur du seul département du Nord
- Même correction appliquée au classeur Excel (feuille 5)

Co-Authored-By: Claude Sonnet 5 <noreply@anthropic.com>
</commit_message>
<xml_diff>
--- a/angle_ips-roubaix_2026-09-15.docx
+++ b/angle_ips-roubaix_2026-09-15.docx
@@ -1058,7 +1058,7 @@
           <w:p>
             <w:r/>
             <w:r>
-              <w:t>Lycées (voie GT, réf. officielle)</w:t>
+              <w:t>Lycées — voie GT (n=7)</w:t>
             </w:r>
           </w:p>
         </w:tc>
@@ -1069,7 +1069,10 @@
           <w:p>
             <w:r/>
             <w:r>
-              <w:t>—</w:t>
+              <w:rPr>
+                <w:b/>
+              </w:rPr>
+              <w:t>95,0</w:t>
             </w:r>
           </w:p>
         </w:tc>
@@ -1092,6 +1095,55 @@
             <w:r/>
             <w:r>
               <w:t>120,2</w:t>
+            </w:r>
+          </w:p>
+        </w:tc>
+      </w:tr>
+      <w:tr>
+        <w:tc>
+          <w:tcPr>
+            <w:tcW w:type="dxa" w:w="2160"/>
+          </w:tcPr>
+          <w:p>
+            <w:r/>
+            <w:r>
+              <w:t>Lycées — voie PRO (n=7)</w:t>
+            </w:r>
+          </w:p>
+        </w:tc>
+        <w:tc>
+          <w:tcPr>
+            <w:tcW w:type="dxa" w:w="2160"/>
+          </w:tcPr>
+          <w:p>
+            <w:r/>
+            <w:r>
+              <w:rPr>
+                <w:b/>
+              </w:rPr>
+              <w:t>80,2</w:t>
+            </w:r>
+          </w:p>
+        </w:tc>
+        <w:tc>
+          <w:tcPr>
+            <w:tcW w:type="dxa" w:w="2160"/>
+          </w:tcPr>
+          <w:p>
+            <w:r/>
+            <w:r>
+              <w:t>81,6</w:t>
+            </w:r>
+          </w:p>
+        </w:tc>
+        <w:tc>
+          <w:tcPr>
+            <w:tcW w:type="dxa" w:w="2160"/>
+          </w:tcPr>
+          <w:p>
+            <w:r/>
+            <w:r>
+              <w:t>89,9</w:t>
             </w:r>
           </w:p>
         </w:tc>
@@ -1133,7 +1185,18 @@
         <w:t>fr-en-ips-lycees-ap2023</w:t>
       </w:r>
       <w:r>
-        <w:t xml:space="preserve"> (2025-2026) — colonnes IPS académique/national officielles.</w:t>
+        <w:t xml:space="preserve"> (2025-2026) — colonnes IPS académique/national officielles. Le lycée est scindé en deux voies : les deux IPS (GT et PRO) ne sont pas comparables entre eux, seulement au sein de la même voie. La ligne « ensemble » (mêlant GT, PRO et parfois post-bac) n'est pas présentée ici, voir la mise en garde ana_05bis sur ce risque.</w:t>
+      </w:r>
+    </w:p>
+    <w:p>
+      <w:r>
+        <w:rPr>
+          <w:b/>
+        </w:rPr>
+        <w:t>Fait notable :</w:t>
+      </w:r>
+      <w:r>
+        <w:t xml:space="preserve"> contrairement à l'école et au collège, l'écart de la voie professionnelle à Roubaix avec l'académie est faible (80,2 vs 81,6, soit −1,4 point) — la voie pro roubaisienne n'est pas plus défavorisée que la moyenne régionale de la voie pro. C'est la voie GT qui creuse l'écart (95,0 vs 114,2, soit −19,2 points), cohérent avec le constat ana_06 : le vrai clivage lycéen à Roubaix est filière générale/techno vs professionnelle, pas secteur public/privé.</w:t>
       </w:r>
     </w:p>
     <w:p>
@@ -1156,7 +1219,7 @@
         <w:t>26 points à la moyenne nationale</w:t>
       </w:r>
       <w:r>
-        <w:t xml:space="preserve"> — l'équivalent, sur l'échelle IPS, de l'écart entre un établissement REP+ typique et un établissement de centre-ville favorisé.</w:t>
+        <w:t xml:space="preserve"> — l'équivalent, sur l'échelle IPS, de l'écart entre un établissement REP+ typique et un établissement de centre-ville favorisé. Au lycée, l'écart est du même ordre pour la voie générale et technologique (−19,2 points vs l'académie, −25,2 vs la France) mais quasi nul pour la voie professionnelle (−1,4 point vs l'académie) — la voie pro roubaisienne n'est pas un point faible local, elle reflète simplement une moyenne régionale déjà basse.</w:t>
       </w:r>
     </w:p>
     <w:p>

</xml_diff>

<commit_message>
Corrige ana_06 : écart public/privé lycée, séparé par voie (GT/PRO)
La moyenne "lycée" agrégée masquait un vrai écart en voie pro (+17,4,
proche du collège) derrière un chiffre global trompeur (+4,6). Le privé
garde son avantage dans les deux voies, contrairement à ce qu'affichait
la moyenne mélangée. Effectifs (n) ajoutés au tableau pour la même raison
qui a motivé la correction : la colonne n_prive n'existe qu'après la
séparation GT/PRO (2 et 3, pas "4" comme écrit initialement ailleurs).

Co-Authored-By: Claude Sonnet 5 <noreply@anthropic.com>
</commit_message>
<xml_diff>
--- a/angle_ips-roubaix_2026-09-15.docx
+++ b/angle_ips-roubaix_2026-09-15.docx
@@ -613,15 +613,17 @@
         <w:tblLook w:firstColumn="1" w:firstRow="1" w:lastColumn="0" w:lastRow="0" w:noHBand="0" w:noVBand="1" w:val="04A0"/>
       </w:tblPr>
       <w:tblGrid>
-        <w:gridCol w:w="2160"/>
-        <w:gridCol w:w="2160"/>
-        <w:gridCol w:w="2160"/>
-        <w:gridCol w:w="2160"/>
+        <w:gridCol w:w="1440"/>
+        <w:gridCol w:w="1440"/>
+        <w:gridCol w:w="1440"/>
+        <w:gridCol w:w="1440"/>
+        <w:gridCol w:w="1440"/>
+        <w:gridCol w:w="1440"/>
       </w:tblGrid>
       <w:tr>
         <w:tc>
           <w:tcPr>
-            <w:tcW w:type="dxa" w:w="2160"/>
+            <w:tcW w:type="dxa" w:w="1440"/>
           </w:tcPr>
           <w:p>
             <w:r>
@@ -639,7 +641,7 @@
         </w:tc>
         <w:tc>
           <w:tcPr>
-            <w:tcW w:type="dxa" w:w="2160"/>
+            <w:tcW w:type="dxa" w:w="1440"/>
           </w:tcPr>
           <w:p>
             <w:r>
@@ -657,7 +659,25 @@
         </w:tc>
         <w:tc>
           <w:tcPr>
-            <w:tcW w:type="dxa" w:w="2160"/>
+            <w:tcW w:type="dxa" w:w="1440"/>
+          </w:tcPr>
+          <w:p>
+            <w:r>
+              <w:rPr>
+                <w:b/>
+              </w:rPr>
+            </w:r>
+            <w:r>
+              <w:rPr>
+                <w:b/>
+              </w:rPr>
+              <w:t>n</w:t>
+            </w:r>
+          </w:p>
+        </w:tc>
+        <w:tc>
+          <w:tcPr>
+            <w:tcW w:type="dxa" w:w="1440"/>
           </w:tcPr>
           <w:p>
             <w:r>
@@ -675,7 +695,25 @@
         </w:tc>
         <w:tc>
           <w:tcPr>
-            <w:tcW w:type="dxa" w:w="2160"/>
+            <w:tcW w:type="dxa" w:w="1440"/>
+          </w:tcPr>
+          <w:p>
+            <w:r>
+              <w:rPr>
+                <w:b/>
+              </w:rPr>
+            </w:r>
+            <w:r>
+              <w:rPr>
+                <w:b/>
+              </w:rPr>
+              <w:t>n</w:t>
+            </w:r>
+          </w:p>
+        </w:tc>
+        <w:tc>
+          <w:tcPr>
+            <w:tcW w:type="dxa" w:w="1440"/>
           </w:tcPr>
           <w:p>
             <w:r>
@@ -695,7 +733,7 @@
       <w:tr>
         <w:tc>
           <w:tcPr>
-            <w:tcW w:type="dxa" w:w="2160"/>
+            <w:tcW w:type="dxa" w:w="1440"/>
           </w:tcPr>
           <w:p>
             <w:r/>
@@ -706,7 +744,7 @@
         </w:tc>
         <w:tc>
           <w:tcPr>
-            <w:tcW w:type="dxa" w:w="2160"/>
+            <w:tcW w:type="dxa" w:w="1440"/>
           </w:tcPr>
           <w:p>
             <w:r/>
@@ -717,7 +755,18 @@
         </w:tc>
         <w:tc>
           <w:tcPr>
-            <w:tcW w:type="dxa" w:w="2160"/>
+            <w:tcW w:type="dxa" w:w="1440"/>
+          </w:tcPr>
+          <w:p>
+            <w:r/>
+            <w:r>
+              <w:t>32</w:t>
+            </w:r>
+          </w:p>
+        </w:tc>
+        <w:tc>
+          <w:tcPr>
+            <w:tcW w:type="dxa" w:w="1440"/>
           </w:tcPr>
           <w:p>
             <w:r/>
@@ -728,7 +777,18 @@
         </w:tc>
         <w:tc>
           <w:tcPr>
-            <w:tcW w:type="dxa" w:w="2160"/>
+            <w:tcW w:type="dxa" w:w="1440"/>
+          </w:tcPr>
+          <w:p>
+            <w:r/>
+            <w:r>
+              <w:t>9</w:t>
+            </w:r>
+          </w:p>
+        </w:tc>
+        <w:tc>
+          <w:tcPr>
+            <w:tcW w:type="dxa" w:w="1440"/>
           </w:tcPr>
           <w:p>
             <w:r/>
@@ -744,7 +804,7 @@
       <w:tr>
         <w:tc>
           <w:tcPr>
-            <w:tcW w:type="dxa" w:w="2160"/>
+            <w:tcW w:type="dxa" w:w="1440"/>
           </w:tcPr>
           <w:p>
             <w:r/>
@@ -755,7 +815,7 @@
         </w:tc>
         <w:tc>
           <w:tcPr>
-            <w:tcW w:type="dxa" w:w="2160"/>
+            <w:tcW w:type="dxa" w:w="1440"/>
           </w:tcPr>
           <w:p>
             <w:r/>
@@ -766,7 +826,18 @@
         </w:tc>
         <w:tc>
           <w:tcPr>
-            <w:tcW w:type="dxa" w:w="2160"/>
+            <w:tcW w:type="dxa" w:w="1440"/>
+          </w:tcPr>
+          <w:p>
+            <w:r/>
+            <w:r>
+              <w:t>7</w:t>
+            </w:r>
+          </w:p>
+        </w:tc>
+        <w:tc>
+          <w:tcPr>
+            <w:tcW w:type="dxa" w:w="1440"/>
           </w:tcPr>
           <w:p>
             <w:r/>
@@ -777,7 +848,18 @@
         </w:tc>
         <w:tc>
           <w:tcPr>
-            <w:tcW w:type="dxa" w:w="2160"/>
+            <w:tcW w:type="dxa" w:w="1440"/>
+          </w:tcPr>
+          <w:p>
+            <w:r/>
+            <w:r>
+              <w:t>5</w:t>
+            </w:r>
+          </w:p>
+        </w:tc>
+        <w:tc>
+          <w:tcPr>
+            <w:tcW w:type="dxa" w:w="1440"/>
           </w:tcPr>
           <w:p>
             <w:r/>
@@ -793,45 +875,138 @@
       <w:tr>
         <w:tc>
           <w:tcPr>
-            <w:tcW w:type="dxa" w:w="2160"/>
+            <w:tcW w:type="dxa" w:w="1440"/>
           </w:tcPr>
           <w:p>
             <w:r/>
             <w:r>
-              <w:t>Lycées</w:t>
+              <w:t>Lycées — voie GT</w:t>
             </w:r>
           </w:p>
         </w:tc>
         <w:tc>
           <w:tcPr>
-            <w:tcW w:type="dxa" w:w="2160"/>
+            <w:tcW w:type="dxa" w:w="1440"/>
           </w:tcPr>
           <w:p>
             <w:r/>
             <w:r>
-              <w:t>88,7</w:t>
+              <w:t>94,0</w:t>
             </w:r>
           </w:p>
         </w:tc>
         <w:tc>
           <w:tcPr>
-            <w:tcW w:type="dxa" w:w="2160"/>
+            <w:tcW w:type="dxa" w:w="1440"/>
           </w:tcPr>
           <w:p>
             <w:r/>
             <w:r>
-              <w:t>93,3</w:t>
+              <w:t>5</w:t>
             </w:r>
           </w:p>
         </w:tc>
         <w:tc>
           <w:tcPr>
-            <w:tcW w:type="dxa" w:w="2160"/>
+            <w:tcW w:type="dxa" w:w="1440"/>
           </w:tcPr>
           <w:p>
             <w:r/>
             <w:r>
-              <w:t>+4,6</w:t>
+              <w:t>97,5</w:t>
+            </w:r>
+          </w:p>
+        </w:tc>
+        <w:tc>
+          <w:tcPr>
+            <w:tcW w:type="dxa" w:w="1440"/>
+          </w:tcPr>
+          <w:p>
+            <w:r/>
+            <w:r>
+              <w:t>2</w:t>
+            </w:r>
+          </w:p>
+        </w:tc>
+        <w:tc>
+          <w:tcPr>
+            <w:tcW w:type="dxa" w:w="1440"/>
+          </w:tcPr>
+          <w:p>
+            <w:r/>
+            <w:r>
+              <w:t>+3,5</w:t>
+            </w:r>
+          </w:p>
+        </w:tc>
+      </w:tr>
+      <w:tr>
+        <w:tc>
+          <w:tcPr>
+            <w:tcW w:type="dxa" w:w="1440"/>
+          </w:tcPr>
+          <w:p>
+            <w:r/>
+            <w:r>
+              <w:t>Lycées — voie PRO</w:t>
+            </w:r>
+          </w:p>
+        </w:tc>
+        <w:tc>
+          <w:tcPr>
+            <w:tcW w:type="dxa" w:w="1440"/>
+          </w:tcPr>
+          <w:p>
+            <w:r/>
+            <w:r>
+              <w:t>72,7</w:t>
+            </w:r>
+          </w:p>
+        </w:tc>
+        <w:tc>
+          <w:tcPr>
+            <w:tcW w:type="dxa" w:w="1440"/>
+          </w:tcPr>
+          <w:p>
+            <w:r/>
+            <w:r>
+              <w:t>4</w:t>
+            </w:r>
+          </w:p>
+        </w:tc>
+        <w:tc>
+          <w:tcPr>
+            <w:tcW w:type="dxa" w:w="1440"/>
+          </w:tcPr>
+          <w:p>
+            <w:r/>
+            <w:r>
+              <w:t>90,1</w:t>
+            </w:r>
+          </w:p>
+        </w:tc>
+        <w:tc>
+          <w:tcPr>
+            <w:tcW w:type="dxa" w:w="1440"/>
+          </w:tcPr>
+          <w:p>
+            <w:r/>
+            <w:r>
+              <w:t>3</w:t>
+            </w:r>
+          </w:p>
+        </w:tc>
+        <w:tc>
+          <w:tcPr>
+            <w:tcW w:type="dxa" w:w="1440"/>
+          </w:tcPr>
+          <w:p>
+            <w:r/>
+            <w:r>
+              <w:rPr>
+                <w:b/>
+              </w:rPr>
+              <w:t>+17,4</w:t>
             </w:r>
           </w:p>
         </w:tc>
@@ -843,19 +1018,25 @@
         <w:rPr>
           <w:b/>
         </w:rPr>
-        <w:t>Contre-intuitif [angle fort] :</w:t>
+        <w:t>Important — ne pas répéter l'erreur d'une moyenne « lycée » unique</w:t>
       </w:r>
       <w:r>
-        <w:t xml:space="preserve"> l'écart public/privé, massif à l'école et au collège (23 à 26 points), </w:t>
+        <w:t xml:space="preserve"> : en mélangeant voie GT et voie PRO dans une moyenne globale, l'écart public/privé au lycée semble s'effondrer (à peine +4,6 points, calcul de brouillon écarté ici). En réalité, une fois les deux voies séparées, </w:t>
       </w:r>
       <w:r>
         <w:rPr>
           <w:b/>
         </w:rPr>
-        <w:t>s'effondre au lycée</w:t>
+        <w:t>l'avantage du privé reste fort dans les deux filières</w:t>
       </w:r>
       <w:r>
-        <w:t xml:space="preserve"> (4,6 points). Explication visible dans les données : à Roubaix, le privé sous contrat au lycée est en réalité dominé par des filières professionnelles (Saint-François d'Assise, Léonard de Vinci, 89-90 de moyenne), tandis que le public compte deux établissements nettement au-dessus de la moyenne roubaisienne (lycée technologique Arts Appliqués Textile, 127,7 ; Maxence Van Der Meersch GT, 101,3). Le clivage social à Roubaix n'est donc pas simplement « privé contre public » mais aussi une question de filière (générale/techno vs professionnelle).</w:t>
+        <w:t xml:space="preserve"> — massif en PRO (+17,4, presque autant qu'au collège), plus modéré en GT (+3,5, sur seulement 5 établissements publics et 2 privés, échantillon très réduit). Ce qui brouillait le signal dans une moyenne globale : les lycées privés roubaisiens scolarisent proportionnellement plus d'élèves en voie pro (dont le niveau général est plus bas), ce qui tirait leur moyenne d'ensemble vers le bas et donnait une fausse impression de rapprochement avec le public. </w:t>
+      </w:r>
+      <w:r>
+        <w:rPr>
+          <w:b/>
+        </w:rPr>
+        <w:t>Toujours comparer voie à voie, jamais un IPS « lycée » agrégé entre établissements de profils différents.</w:t>
       </w:r>
     </w:p>
     <w:p>
@@ -1196,7 +1377,7 @@
         <w:t>Fait notable :</w:t>
       </w:r>
       <w:r>
-        <w:t xml:space="preserve"> contrairement à l'école et au collège, l'écart de la voie professionnelle à Roubaix avec l'académie est faible (80,2 vs 81,6, soit −1,4 point) — la voie pro roubaisienne n'est pas plus défavorisée que la moyenne régionale de la voie pro. C'est la voie GT qui creuse l'écart (95,0 vs 114,2, soit −19,2 points), cohérent avec le constat ana_06 : le vrai clivage lycéen à Roubaix est filière générale/techno vs professionnelle, pas secteur public/privé.</w:t>
+        <w:t xml:space="preserve"> contrairement à l'école et au collège, l'écart de la voie professionnelle à Roubaix avec l'académie est faible (80,2 vs 81,6, soit −1,4 point) — la voie pro roubaisienne n'est pas plus défavorisée que la moyenne régionale de la voie pro. C'est la voie GT qui creuse l'écart avec l'académie (95,0 vs 114,2, soit −19,2 points). Ce constat (comparaison Roubaix/académie, toutes filières confondues) est indépendant de celui d'ana_06 (écart public/privé, à l'intérieur même de Roubaix) : les deux se lisent séparément, ne pas les confondre dans la rédaction.</w:t>
       </w:r>
     </w:p>
     <w:p>
@@ -1869,12 +2050,12 @@
         <w:rPr>
           <w:b/>
         </w:rPr>
-        <w:t>§4 — Bascule contre-intuitive : le privé n'explique pas tout [ana_06]</w:t>
+        <w:t>§4 — L'avantage du privé, y compris en filière pro [ana_06]</w:t>
       </w:r>
     </w:p>
     <w:p>
       <w:r>
-        <w:t>Montrer que l'écart public/privé, énorme à l'école (+23) et au collège (+26), s'effondre au lycée (+4,6) — parce qu'à Roubaix le privé lycéen est surtout professionnel. Le vrai clivage lycéen est filière générale/techno vs professionnelle, pas secteur.</w:t>
+        <w:t>Montrer l'écart public/privé à chaque niveau — école (+23), collège (+26), lycée voie GT (+3,5, échantillon réduit) et voie PRO (+17,4). Le message : l'avantage du privé ne s'efface pas au lycée professionnel, contrairement à une lecture rapide en IPS « lycée » moyen — il faut juste comparer voie à voie pour le voir.</w:t>
       </w:r>
     </w:p>
     <w:p>
@@ -1884,7 +2065,7 @@
           <w:color w:val="606060"/>
           <w:sz w:val="20"/>
         </w:rPr>
-        <w:t>[SUGGESTION VISUELLE : petit graphique à 3 paires de barres (école/collège/lycée, public vs privé)]</w:t>
+        <w:t>[SUGGESTION VISUELLE : petit graphique à 4 paires de barres (école/collège/lycée GT/lycée PRO, public vs privé)]</w:t>
       </w:r>
     </w:p>
     <w:p>

</xml_diff>